<commit_message>
more R1 response to reviewers
</commit_message>
<xml_diff>
--- a/Docs/00_CanJFS/InitialSubmit/01_CanJFS_MainDocument.docx
+++ b/Docs/00_CanJFS/InitialSubmit/01_CanJFS_MainDocument.docx
@@ -932,7 +932,13 @@
         <w:rPr>
           <w:rFonts w:ascii="Garamond" w:hAnsi="Garamond" w:cs="Times New Roman"/>
         </w:rPr>
-        <w:t xml:space="preserve">. Further, maintaining life history diversity across the full stock complex contributes to ecosystem resilience by distributing population level risk across space and time </w:t>
+        <w:t>. Further, maintaining life history diversity across the full stock complex contributes to ecosystem resilience by distributing population level risk across space and time</w:t>
+      </w:r>
+      <w:r>
+        <w:rPr>
+          <w:rFonts w:ascii="Garamond" w:hAnsi="Garamond" w:cs="Times New Roman"/>
+        </w:rPr>
+        <w:t xml:space="preserve"> </w:t>
       </w:r>
       <w:r>
         <w:rPr>
@@ -5555,6 +5561,7 @@
         <w:pStyle w:val="Bibliography"/>
         <w:rPr>
           <w:rFonts w:ascii="Garamond" w:hAnsi="Garamond"/>
+          <w:lang w:val="fr-FR"/>
         </w:rPr>
       </w:pPr>
       <w:r>
@@ -5568,12 +5575,14 @@
           <w:rFonts w:ascii="Garamond" w:hAnsi="Garamond"/>
           <w:i/>
           <w:iCs/>
+          <w:lang w:val="fr-FR"/>
         </w:rPr>
         <w:t>Nature</w:t>
       </w:r>
       <w:r>
         <w:rPr>
           <w:rFonts w:ascii="Garamond" w:hAnsi="Garamond"/>
+          <w:lang w:val="fr-FR"/>
         </w:rPr>
         <w:t xml:space="preserve">, </w:t>
       </w:r>
@@ -5582,12 +5591,14 @@
           <w:rFonts w:ascii="Garamond" w:hAnsi="Garamond"/>
           <w:i/>
           <w:iCs/>
+          <w:lang w:val="fr-FR"/>
         </w:rPr>
         <w:t>465</w:t>
       </w:r>
       <w:r>
         <w:rPr>
           <w:rFonts w:ascii="Garamond" w:hAnsi="Garamond"/>
+          <w:lang w:val="fr-FR"/>
         </w:rPr>
         <w:t>(7298). https://doi-org.prox.lib.ncsu.edu/10.1038/nature09060</w:t>
       </w:r>
@@ -5602,17 +5613,28 @@
       <w:r>
         <w:rPr>
           <w:rFonts w:ascii="Garamond" w:hAnsi="Garamond"/>
+          <w:lang w:val="fr-FR"/>
         </w:rPr>
         <w:lastRenderedPageBreak/>
         <w:t xml:space="preserve">Smith, N. J., &amp; Liller, Z. W. (2017a). </w:t>
       </w:r>
-      <w:r>
-        <w:rPr>
-          <w:rFonts w:ascii="Garamond" w:hAnsi="Garamond"/>
-          <w:i/>
-          <w:iCs/>
-        </w:rPr>
-        <w:t>Inriver abundance and migration characteristics of Kuskokwim River Chinook salmon, 2015.</w:t>
+      <w:proofErr w:type="spellStart"/>
+      <w:r>
+        <w:rPr>
+          <w:rFonts w:ascii="Garamond" w:hAnsi="Garamond"/>
+          <w:i/>
+          <w:iCs/>
+        </w:rPr>
+        <w:t>Inriver</w:t>
+      </w:r>
+      <w:proofErr w:type="spellEnd"/>
+      <w:r>
+        <w:rPr>
+          <w:rFonts w:ascii="Garamond" w:hAnsi="Garamond"/>
+          <w:i/>
+          <w:iCs/>
+        </w:rPr>
+        <w:t xml:space="preserve"> abundance and migration characteristics of Kuskokwim River Chinook salmon, 2015.</w:t>
       </w:r>
       <w:r>
         <w:rPr>
@@ -5667,8 +5689,15 @@
       <w:r>
         <w:rPr>
           <w:rFonts w:ascii="Garamond" w:hAnsi="Garamond"/>
-        </w:rPr>
-        <w:t xml:space="preserve">Staton, B. A., Catalano, M. J., Farmer, T. M., Abebe, A., &amp; Dobson, F. S. (2017). Development and evaluation of a migration timing forecast model for Kuskokwim River Chinook salmon. </w:t>
+          <w:lang w:val="es-ES"/>
+        </w:rPr>
+        <w:t xml:space="preserve">Staton, B. A., Catalano, M. J., Farmer, T. M., Abebe, A., &amp; Dobson, F. S. (2017). </w:t>
+      </w:r>
+      <w:r>
+        <w:rPr>
+          <w:rFonts w:ascii="Garamond" w:hAnsi="Garamond"/>
+        </w:rPr>
+        <w:t xml:space="preserve">Development and evaluation of a migration timing forecast model for Kuskokwim River Chinook salmon. </w:t>
       </w:r>
       <w:r>
         <w:rPr>

</xml_diff>